<commit_message>
SLA: Servicezeiten auf 9 bis 17 Uhr, Stand-Datum nachgezogen
Die Servicezeiten standen noch auf 8 bis 17 Uhr, waehrend Buchung und
Agenten seit heute 9 bis 17 anbieten. Angepasst sind beide Stellen in
Anlage C (Servicezeiten selbst und der Beginn der Reaktionsfrist am
naechsten Werktag) sowie die Erklaerfassung.

Ausserdem trugen sieben Dokumente noch "Stand: Juli 2026", obwohl sich
ihr Inhalt gestern und heute geaendert hat. Sie stehen jetzt auf
September 2026; das unveraenderte SEPA-Mandat behaelt sein Datum.

Co-Authored-By: Claude Opus 5 <noreply@anthropic.com>
</commit_message>
<xml_diff>
--- a/vertrag/05_AnlageC_SLA.docx
+++ b/vertrag/05_AnlageC_SLA.docx
@@ -62,7 +62,7 @@
           <w:sz w:val="18"/>
           <w:szCs w:val="18"/>
         </w:rPr>
-        <w:t xml:space="preserve">Stand: Juli 2026</w:t>
+        <w:t xml:space="preserve">Stand: September 2026</w:t>
       </w:r>
     </w:p>
     <w:p>
@@ -365,7 +365,7 @@
           <w:sz w:val="21"/>
           <w:szCs w:val="21"/>
         </w:rPr>
-        <w:t xml:space="preserve">08:00 bis 17:00 Uhr</w:t>
+        <w:t xml:space="preserve">09:00 bis 17:00 Uhr</w:t>
       </w:r>
       <w:r>
         <w:rPr>
@@ -488,7 +488,7 @@
           <w:sz w:val="21"/>
           <w:szCs w:val="21"/>
         </w:rPr>
-        <w:t xml:space="preserve">Supportanfragen, die außerhalb der Servicezeiten eingehen, gelten als am nächsten Werktag zu Beginn der Servicezeiten (08:00 Uhr) eingegangen. Die in Abschnitt 4 genannten Reaktionszeiten beginnen erst mit diesem Zeitpunkt zu laufen und werden ausschließlich innerhalb der Servicezeiten berechnet.</w:t>
+        <w:t xml:space="preserve">Supportanfragen, die außerhalb der Servicezeiten eingehen, gelten als am nächsten Werktag zu Beginn der Servicezeiten (09:00 Uhr) eingegangen. Die in Abschnitt 4 genannten Reaktionszeiten beginnen erst mit diesem Zeitpunkt zu laufen und werden ausschließlich innerhalb der Servicezeiten berechnet.</w:t>
       </w:r>
     </w:p>
     <w:p>

</xml_diff>